<commit_message>
docs(nv5): add traceable demo evidence to final report
</commit_message>
<xml_diff>
--- a/report/deliverables/bao_cao_nhom_tomato_two_models_nv5.docx
+++ b/report/deliverables/bao_cao_nhom_tomato_two_models_nv5.docx
@@ -170,7 +170,7 @@
     </w:p>
     <w:p>
       <w:r>
-        <w:t>NV4 đã kiểm chứng demo Streamlit với cả checkpoint CNN và ResNet18 thật: strict-load CPU, demo.check_consistency --model both PASS với max |delta| = 0 và metric ResNet18 Test tái hiện trên CPU. Ảnh/video demo cuối cần NV4 xác nhận trước khi chốt báo cáo.</w:t>
+        <w:t>NV4 đã kiểm chứng demo Streamlit với cả checkpoint CNN và ResNet18 thật: strict-load CPU, demo.check_consistency --model both PASS với max |delta| = 0 và metric ResNet18 Test tái hiện trên CPU. Ảnh chụp demo có nguồn NV4 được đưa vào phần 3.5; video trình diễn chưa được bàn giao.</w:t>
       </w:r>
     </w:p>
     <w:p>
@@ -210,6 +210,9 @@
         <w:gridCol w:w="1632"/>
       </w:tblGrid>
       <w:tr>
+        <w:trPr>
+          <w:tblHeader w:val="true"/>
+        </w:trPr>
         <w:tc>
           <w:tcPr>
             <w:tcW w:type="dxa" w:w="1632"/>
@@ -610,6 +613,9 @@
         <w:gridCol w:w="2448"/>
       </w:tblGrid>
       <w:tr>
+        <w:trPr>
+          <w:tblHeader w:val="true"/>
+        </w:trPr>
         <w:tc>
           <w:tcPr>
             <w:tcW w:type="dxa" w:w="2448"/>
@@ -1040,6 +1046,108 @@
     </w:p>
     <w:p>
       <w:pPr>
+        <w:jc w:val="center"/>
+      </w:pPr>
+      <w:r>
+        <w:drawing>
+          <wp:inline xmlns:a="http://schemas.openxmlformats.org/drawingml/2006/main" xmlns:pic="http://schemas.openxmlformats.org/drawingml/2006/picture">
+            <wp:extent cx="5394960" cy="2157984"/>
+            <wp:docPr id="1" name="Picture 1" descr="Ma trận nhầm lẫn CNN trên 1.356 ảnh Test."/>
+            <wp:cNvGraphicFramePr>
+              <a:graphicFrameLocks noChangeAspect="1"/>
+            </wp:cNvGraphicFramePr>
+            <a:graphic>
+              <a:graphicData uri="http://schemas.openxmlformats.org/drawingml/2006/picture">
+                <pic:pic>
+                  <pic:nvPicPr>
+                    <pic:cNvPr id="0" name="cnn_confusion_matrix.png"/>
+                    <pic:cNvPicPr/>
+                  </pic:nvPicPr>
+                  <pic:blipFill>
+                    <a:blip r:embed="rId9"/>
+                    <a:stretch>
+                      <a:fillRect/>
+                    </a:stretch>
+                  </pic:blipFill>
+                  <pic:spPr>
+                    <a:xfrm>
+                      <a:off x="0" y="0"/>
+                      <a:ext cx="5394960" cy="2157984"/>
+                    </a:xfrm>
+                    <a:prstGeom prst="rect"/>
+                  </pic:spPr>
+                </pic:pic>
+              </a:graphicData>
+            </a:graphic>
+          </wp:inline>
+        </w:drawing>
+      </w:r>
+    </w:p>
+    <w:p>
+      <w:pPr>
+        <w:jc w:val="center"/>
+      </w:pPr>
+      <w:r>
+        <w:rPr>
+          <w:i/>
+          <w:sz w:val="18"/>
+        </w:rPr>
+        <w:t>Hình 1. Ma trận nhầm lẫn CNN. Nguồn: prediction CSV NV2, tổng hợp bởi NV5.</w:t>
+      </w:r>
+    </w:p>
+    <w:p>
+      <w:pPr>
+        <w:jc w:val="center"/>
+      </w:pPr>
+      <w:r>
+        <w:drawing>
+          <wp:inline xmlns:a="http://schemas.openxmlformats.org/drawingml/2006/main" xmlns:pic="http://schemas.openxmlformats.org/drawingml/2006/picture">
+            <wp:extent cx="5394960" cy="2157984"/>
+            <wp:docPr id="2" name="Picture 2" descr="Ma trận nhầm lẫn ResNet18 trên 1.356 ảnh Test."/>
+            <wp:cNvGraphicFramePr>
+              <a:graphicFrameLocks noChangeAspect="1"/>
+            </wp:cNvGraphicFramePr>
+            <a:graphic>
+              <a:graphicData uri="http://schemas.openxmlformats.org/drawingml/2006/picture">
+                <pic:pic>
+                  <pic:nvPicPr>
+                    <pic:cNvPr id="0" name="resnet18_confusion_matrix.png"/>
+                    <pic:cNvPicPr/>
+                  </pic:nvPicPr>
+                  <pic:blipFill>
+                    <a:blip r:embed="rId10"/>
+                    <a:stretch>
+                      <a:fillRect/>
+                    </a:stretch>
+                  </pic:blipFill>
+                  <pic:spPr>
+                    <a:xfrm>
+                      <a:off x="0" y="0"/>
+                      <a:ext cx="5394960" cy="2157984"/>
+                    </a:xfrm>
+                    <a:prstGeom prst="rect"/>
+                  </pic:spPr>
+                </pic:pic>
+              </a:graphicData>
+            </a:graphic>
+          </wp:inline>
+        </w:drawing>
+      </w:r>
+    </w:p>
+    <w:p>
+      <w:pPr>
+        <w:jc w:val="center"/>
+      </w:pPr>
+      <w:r>
+        <w:rPr>
+          <w:i/>
+          <w:sz w:val="18"/>
+        </w:rPr>
+        <w:t>Hình 2. Ma trận nhầm lẫn ResNet18. Nguồn: prediction CSV NV3, tổng hợp bởi NV5.</w:t>
+      </w:r>
+    </w:p>
+    <w:p>
+      <w:pPr>
         <w:pStyle w:val="Heading2"/>
       </w:pPr>
       <w:r>
@@ -1058,6 +1166,9 @@
         <w:gridCol w:w="4896"/>
       </w:tblGrid>
       <w:tr>
+        <w:trPr>
+          <w:tblHeader w:val="true"/>
+        </w:trPr>
         <w:tc>
           <w:tcPr>
             <w:tcW w:type="dxa" w:w="4896"/>
@@ -1315,6 +1426,177 @@
     <w:p/>
     <w:p>
       <w:pPr>
+        <w:pStyle w:val="Heading2"/>
+      </w:pPr>
+      <w:r>
+        <w:t>3.5 Minh chứng demo Streamlit</w:t>
+      </w:r>
+    </w:p>
+    <w:p>
+      <w:r>
+        <w:t>NV4 đã strict-load hai checkpoint trên CPU và chạy demo.check_consistency --model both với max |delta| = 0. Các hình dưới đây là ảnh chụp giao diện trên một ảnh Test Bacterial Spot. Chúng minh họa cách sử dụng giao diện, không phải phép đo Accuracy toàn tập.</w:t>
+      </w:r>
+    </w:p>
+    <w:p>
+      <w:pPr>
+        <w:jc w:val="center"/>
+      </w:pPr>
+      <w:r>
+        <w:drawing>
+          <wp:inline xmlns:a="http://schemas.openxmlformats.org/drawingml/2006/main" xmlns:pic="http://schemas.openxmlformats.org/drawingml/2006/picture">
+            <wp:extent cx="5715000" cy="3214688"/>
+            <wp:docPr id="3" name="Picture 3" descr="Ảnh chụp giao diện Streamlit so sánh CNN và ResNet18 trên một ảnh Test Bacterial Spot."/>
+            <wp:cNvGraphicFramePr>
+              <a:graphicFrameLocks noChangeAspect="1"/>
+            </wp:cNvGraphicFramePr>
+            <a:graphic>
+              <a:graphicData uri="http://schemas.openxmlformats.org/drawingml/2006/picture">
+                <pic:pic>
+                  <pic:nvPicPr>
+                    <pic:cNvPr id="0" name="cnn_resnet18_compare_20261030.jpg"/>
+                    <pic:cNvPicPr/>
+                  </pic:nvPicPr>
+                  <pic:blipFill>
+                    <a:blip r:embed="rId11"/>
+                    <a:stretch>
+                      <a:fillRect/>
+                    </a:stretch>
+                  </pic:blipFill>
+                  <pic:spPr>
+                    <a:xfrm>
+                      <a:off x="0" y="0"/>
+                      <a:ext cx="5715000" cy="3214688"/>
+                    </a:xfrm>
+                    <a:prstGeom prst="rect"/>
+                  </pic:spPr>
+                </pic:pic>
+              </a:graphicData>
+            </a:graphic>
+          </wp:inline>
+        </w:drawing>
+      </w:r>
+    </w:p>
+    <w:p>
+      <w:pPr>
+        <w:jc w:val="center"/>
+      </w:pPr>
+      <w:r>
+        <w:rPr>
+          <w:i/>
+          <w:sz w:val="18"/>
+        </w:rPr>
+        <w:t>Hình 3. Chế độ so sánh CNN và ResNet18. Nguồn: NV4 commit 2406b12, demo/screenshots/cnn_resnet18_compare_20261030.jpg.</w:t>
+      </w:r>
+    </w:p>
+    <w:p>
+      <w:pPr>
+        <w:jc w:val="center"/>
+      </w:pPr>
+      <w:r>
+        <w:drawing>
+          <wp:inline xmlns:a="http://schemas.openxmlformats.org/drawingml/2006/main" xmlns:pic="http://schemas.openxmlformats.org/drawingml/2006/picture">
+            <wp:extent cx="3840480" cy="4890436"/>
+            <wp:docPr id="4" name="Picture 4" descr="Ảnh chụp giao diện Streamlit cho lượt dự đoán CNN Bacterial Spot 96,95%."/>
+            <wp:cNvGraphicFramePr>
+              <a:graphicFrameLocks noChangeAspect="1"/>
+            </wp:cNvGraphicFramePr>
+            <a:graphic>
+              <a:graphicData uri="http://schemas.openxmlformats.org/drawingml/2006/picture">
+                <pic:pic>
+                  <pic:nvPicPr>
+                    <pic:cNvPr id="0" name="cnn_prediction_real.jpg"/>
+                    <pic:cNvPicPr/>
+                  </pic:nvPicPr>
+                  <pic:blipFill>
+                    <a:blip r:embed="rId12"/>
+                    <a:stretch>
+                      <a:fillRect/>
+                    </a:stretch>
+                  </pic:blipFill>
+                  <pic:spPr>
+                    <a:xfrm>
+                      <a:off x="0" y="0"/>
+                      <a:ext cx="3840480" cy="4890436"/>
+                    </a:xfrm>
+                    <a:prstGeom prst="rect"/>
+                  </pic:spPr>
+                </pic:pic>
+              </a:graphicData>
+            </a:graphic>
+          </wp:inline>
+        </w:drawing>
+      </w:r>
+    </w:p>
+    <w:p>
+      <w:pPr>
+        <w:jc w:val="center"/>
+      </w:pPr>
+      <w:r>
+        <w:rPr>
+          <w:i/>
+          <w:sz w:val="18"/>
+        </w:rPr>
+        <w:t>Hình 4. CNN dự đoán Bacterial Spot 96,95%. Nguồn: NV4 commit 2406b12.</w:t>
+      </w:r>
+    </w:p>
+    <w:p>
+      <w:pPr>
+        <w:jc w:val="center"/>
+      </w:pPr>
+      <w:r>
+        <w:drawing>
+          <wp:inline xmlns:a="http://schemas.openxmlformats.org/drawingml/2006/main" xmlns:pic="http://schemas.openxmlformats.org/drawingml/2006/picture">
+            <wp:extent cx="3840480" cy="2160270"/>
+            <wp:docPr id="5" name="Picture 5" descr="Ảnh chụp giao diện Streamlit cho lượt dự đoán ResNet18 Bacterial Spot 67,11%."/>
+            <wp:cNvGraphicFramePr>
+              <a:graphicFrameLocks noChangeAspect="1"/>
+            </wp:cNvGraphicFramePr>
+            <a:graphic>
+              <a:graphicData uri="http://schemas.openxmlformats.org/drawingml/2006/picture">
+                <pic:pic>
+                  <pic:nvPicPr>
+                    <pic:cNvPr id="0" name="resnet18_real_20261030.jpg"/>
+                    <pic:cNvPicPr/>
+                  </pic:nvPicPr>
+                  <pic:blipFill>
+                    <a:blip r:embed="rId13"/>
+                    <a:stretch>
+                      <a:fillRect/>
+                    </a:stretch>
+                  </pic:blipFill>
+                  <pic:spPr>
+                    <a:xfrm>
+                      <a:off x="0" y="0"/>
+                      <a:ext cx="3840480" cy="2160270"/>
+                    </a:xfrm>
+                    <a:prstGeom prst="rect"/>
+                  </pic:spPr>
+                </pic:pic>
+              </a:graphicData>
+            </a:graphic>
+          </wp:inline>
+        </w:drawing>
+      </w:r>
+    </w:p>
+    <w:p>
+      <w:pPr>
+        <w:jc w:val="center"/>
+      </w:pPr>
+      <w:r>
+        <w:rPr>
+          <w:i/>
+          <w:sz w:val="18"/>
+        </w:rPr>
+        <w:t>Hình 5. ResNet18 dự đoán Bacterial Spot 67,11%. Nguồn: NV4 commit 2406b12.</w:t>
+      </w:r>
+    </w:p>
+    <w:p>
+      <w:r>
+        <w:t>NV4 chưa bàn giao ảnh chụp riêng cho một dự đoán sai có nhãn thật hiển thị. Báo cáo vì vậy không gắn nhãn lại ảnh demo; các lỗi được trình bày bằng confusion matrix và prediction CSV.</w:t>
+      </w:r>
+    </w:p>
+    <w:p>
+      <w:pPr>
         <w:pStyle w:val="Heading1"/>
       </w:pPr>
       <w:r>
@@ -1378,7 +1660,7 @@
     </w:p>
     <w:p>
       <w:r>
-        <w:t>Tài liệu nội bộ: docs/PHAN_CONG.md, docs/CNN_README.md, Issue #6, PR #7, PR #9 và PR #11.</w:t>
+        <w:t>Tài liệu nội bộ: docs/PHAN_CONG.md, docs/CNN_README.md, Issue #6, PR #7, PR #9, PR #11 và report/RESULTS_TRACEABILITY.md.</w:t>
       </w:r>
     </w:p>
     <w:p>
@@ -1395,7 +1677,7 @@
       </w:r>
     </w:p>
     <w:sectPr>
-      <w:footerReference w:type="default" r:id="rId9"/>
+      <w:footerReference w:type="default" r:id="rId14"/>
       <w:pgSz w:w="12240" w:h="15840"/>
       <w:pgMar w:top="1080" w:right="1224" w:bottom="1008" w:left="1224" w:header="720" w:footer="720" w:gutter="0"/>
       <w:cols w:space="720"/>

</xml_diff>